<commit_message>
docs: RLS ligado em producao e A01 encerrado (D-112)
Co-Authored-By: Claude Sonnet 5.5 <noreply@anthropic.com>
</commit_message>
<xml_diff>
--- a/Auditoria_Seguranca_B2B_ON.docx
+++ b/Auditoria_Seguranca_B2B_ON.docx
@@ -113,10 +113,10 @@
         <w:rPr>
           <w:b/>
         </w:rPr>
-        <w:t xml:space="preserve">A01 Isolamento multi-tenant (ALTA) — em rollout, ainda não resolvido. </w:t>
-      </w:r>
-      <w:r>
-        <w:t xml:space="preserve">A evidência original estava desatualizada: já existiam a varredura sistemática com dois tenants e a matriz de isolamento por rota. Foi implementado o Row-Level Security em duas etapas (D-110 e D-111): 179 tabelas com política (550 políticas), migrações aplicadas em staging e em produção. O staging roda com o papel restrito b2bon_app desde 29/10. A produção passou a conectar com b2bon_app em 29/10 (deploy das 19:55 UTC) e está em observação por 24 a 48 horas; só a partir dessa troca o RLS protege de fato. O achado será dado como resolvido quando a produção for declarada estável. Limite que continua valendo: rotas exclusivas de super_admin, cron e webhooks têm acesso total no banco por desenho (docs/b2bon/RLS.md, seção 7).</w:t>
+        <w:t xml:space="preserve">A01 Isolamento multi-tenant (ALTA) — encerrado em 29/10/2026, com ressalvas. </w:t>
+      </w:r>
+      <w:r>
+        <w:t xml:space="preserve">A evidência original estava desatualizada: já existiam a varredura sistemática com dois tenants e a matriz de isolamento por rota. Foi implementado o Row-Level Security em duas etapas (D-110 e D-111): 179 tabelas com política (550 políticas), migrações aplicadas em staging e em produção. Em 29/10 o staging e a produção passaram a conectar com o papel restrito b2bon_app (produção: deploy das 19:55 UTC), sem superusuário e sem BYPASSRLS; o papel dono ficou só para as migrações. O Neon confirmou a produção conectada como b2bon_app e o log do Render não mostrou erro de RLS, de permissão nem 500 nos primeiros minutos. O responsável encerrou o achado no mesmo dia (D-112), sem a observação de 24 a 48 horas, sem a leitura dos logs desse período e sem o roteiro completo de escrita no staging; as senhas dos papéis expostas durante o rollout foram trocadas, segundo o responsável. Como a falta de contexto no RLS dá tela vazia e não erro, a reversão é voltar DATABASE_URL ao papel dono. Limite que continua valendo: rotas exclusivas de super_admin, cron e webhooks têm acesso total no banco por desenho (docs/b2bon/RLS.md, seção 7).</w:t>
       </w:r>
     </w:p>
     <w:p>
@@ -261,10 +261,10 @@
         <w:rPr>
           <w:b/>
         </w:rPr>
-        <w:t xml:space="preserve">RLS em produção: </w:t>
-      </w:r>
-      <w:r>
-        <w:t xml:space="preserve">concluir a observação de 24 a 48 horas, rodar o cron manualmente uma vez, conferir as telas principais e declarar a produção estável.</w:t>
+        <w:t xml:space="preserve">Ressalvas do encerramento do A01: </w:t>
+      </w:r>
+      <w:r>
+        <w:t xml:space="preserve">rodar o cron-envios.yml manualmente, exercitar as telas principais e ler os logs de produção; qualquer tela vazia ou com zeros onde antes havia dado deve ser tratada como possível falta de contexto do RLS.</w:t>
       </w:r>
     </w:p>
     <w:p>
@@ -278,7 +278,7 @@
         <w:t xml:space="preserve">Credenciais do banco: </w:t>
       </w:r>
       <w:r>
-        <w:t xml:space="preserve">trocar as senhas do papel b2bon_app e do neondb_owner de produção, que circularam em conversa durante o rollout, e atualizar DATABASE_URL e MIGRATION_DATABASE_URL no Render e os secrets do GitHub que usam a URL do dono.</w:t>
+        <w:t xml:space="preserve">senhas do b2bon_app e do neondb_owner de produção trocadas, segundo o responsável; conferir que DATABASE_URL e MIGRATION_DATABASE_URL no Render e os secrets do GitHub que usam a URL do dono estão atualizados.</w:t>
       </w:r>
     </w:p>
     <w:p>

</xml_diff>

<commit_message>
docs: precos de planos no endpoint publico mantidos por decisao do PO (A07, D-114)
Co-Authored-By: Claude Sonnet 5.5 <noreply@anthropic.com>
</commit_message>
<xml_diff>
--- a/Auditoria_Seguranca_B2B_ON.docx
+++ b/Auditoria_Seguranca_B2B_ON.docx
@@ -197,10 +197,10 @@
         <w:rPr>
           <w:b/>
         </w:rPr>
-        <w:t xml:space="preserve">A07 Preços de planos no endpoint público (BAIXA) — sem alteração. </w:t>
-      </w:r>
-      <w:r>
-        <w:t xml:space="preserve">Aguarda decisão comercial. GET /api/v1/planos continua listando planos não self-service com preços; é preciso confirmar se a publicação é intencional.</w:t>
+        <w:t xml:space="preserve">A07 Preços de planos no endpoint público (BAIXA) — risco aceito pelo responsável em 30/10/2026. </w:t>
+      </w:r>
+      <w:r>
+        <w:t xml:space="preserve">O responsável decidiu que a exposição é intencional e estratégica: dá aos interessados acesso aos valores e aos perfis de contratação, prática que, segundo ele, é adotada pelos fabricantes de CRM do mercado. Nenhuma alteração de código. O endpoint continua devolvendo preços, limites, permissões, módulos e entitlements dos planos, inclusive os não self-service; o esquema de resposta não contém custo nem margem.</w:t>
       </w:r>
     </w:p>
     <w:p>
@@ -289,10 +289,10 @@
         <w:rPr>
           <w:b/>
         </w:rPr>
-        <w:t xml:space="preserve">Decisões de produto e comerciais: </w:t>
-      </w:r>
-      <w:r>
-        <w:t xml:space="preserve">A07 (planos públicos), MFA para administradores e atraso progressivo (A06), sessão de vida curta com refresh rotativo (A04).</w:t>
+        <w:t xml:space="preserve">Decisões de produto: </w:t>
+      </w:r>
+      <w:r>
+        <w:t xml:space="preserve">MFA para administradores e atraso progressivo (A06), sessão de vida curta com refresh rotativo (A04).</w:t>
       </w:r>
     </w:p>
     <w:p>

</xml_diff>